<commit_message>
Spécifications : nom corrigé dans le Word, PDF réexporté ; PLAN : cartes de Maître du jeu terminées
Co-Authored-By: Claude Opus 5.5 <noreply@anthropic.com>
</commit_message>
<xml_diff>
--- a/docs/Greed Island - Spécifications fonctionnelles.docx
+++ b/docs/Greed Island - Spécifications fonctionnelles.docx
@@ -97,11 +97,9 @@
       <w:r>
         <w:t xml:space="preserve">Greed </w:t>
       </w:r>
-      <w:proofErr w:type="spellStart"/>
-      <w:r>
-        <w:t>Quest</w:t>
-      </w:r>
-      <w:proofErr w:type="spellEnd"/>
+      <w:r>
+        <w:t>Island</w:t>
+      </w:r>
       <w:r>
         <w:t xml:space="preserve"> est une chasse au trésor grandeur nature qui se joue avec son téléphone. L’idée vient du manga Hunter x Hunter, et plus précisément de Greed Island, un jeu dans lequel les personnages doivent réunir une collection complète de cartes magiques.</w:t>
       </w:r>
@@ -111,10 +109,7 @@
         <w:spacing w:after="120" w:line="300" w:lineRule="auto"/>
       </w:pPr>
       <w:r>
-        <w:t>S</w:t>
-      </w:r>
-      <w:r>
-        <w:t xml:space="preserve">ur un terrain (un parc, un site d’événement, un campus), l’organisation installe des </w:t>
+        <w:t xml:space="preserve">Sur un terrain (un parc, un site d’événement, un campus), l’organisation installe des </w:t>
       </w:r>
       <w:r>
         <w:rPr>
@@ -144,10 +139,7 @@
         <w:t>Livre</w:t>
       </w:r>
       <w:r>
-        <w:t>,</w:t>
-      </w:r>
-      <w:r>
-        <w:t xml:space="preserve"> c’est-à-dire sa collection.</w:t>
+        <w:t>, c’est-à-dire sa collection.</w:t>
       </w:r>
     </w:p>
     <w:p>
@@ -183,18 +175,7 @@
         <w:spacing w:after="120" w:line="300" w:lineRule="auto"/>
       </w:pPr>
       <w:r>
-        <w:t>Chacun joue pour soi, ma</w:t>
-      </w:r>
-      <w:r>
-        <w:t>is le jeu pousse à interagir : on peut échanger des cartes, en acheter, s’</w:t>
-      </w:r>
-      <w:proofErr w:type="spellStart"/>
-      <w:r>
-        <w:t>en voler</w:t>
-      </w:r>
-      <w:proofErr w:type="spellEnd"/>
-      <w:r>
-        <w:t xml:space="preserve"> grâce à des sorts, et même refiler de fausses cartes. Certaines cartes sont liées à de vrais lots offerts par l’organisateur.</w:t>
+        <w:t>Chacun joue pour soi, mais le jeu pousse à interagir : on peut échanger des cartes, en acheter, s’en voler grâce à des sorts, et même refiler de fausses cartes. Certaines cartes sont liées à de vrais lots offerts par l’organisateur.</w:t>
       </w:r>
     </w:p>
     <w:p>
@@ -210,10 +191,7 @@
         <w:spacing w:after="120" w:line="300" w:lineRule="auto"/>
       </w:pPr>
       <w:r>
-        <w:t>Quatre types de participants i</w:t>
-      </w:r>
-      <w:r>
-        <w:t>nterviennent pendant une partie.</w:t>
+        <w:t>Quatre types de participants interviennent pendant une partie.</w:t>
       </w:r>
     </w:p>
     <w:tbl>
@@ -645,10 +623,7 @@
               <w:spacing w:line="270" w:lineRule="auto"/>
             </w:pPr>
             <w:r>
-              <w:t>Prépare la partie, la démarre, la met en pause, lanc</w:t>
-            </w:r>
-            <w:r>
-              <w:t>e les évènements, corrige, valide le Clear, disqualifie</w:t>
+              <w:t>Prépare la partie, la démarre, la met en pause, lance les évènements, corrige, valide le Clear, disqualifie</w:t>
             </w:r>
           </w:p>
         </w:tc>
@@ -811,10 +786,7 @@
         <w:spacing w:after="120" w:line="300" w:lineRule="auto"/>
       </w:pPr>
       <w:r>
-        <w:t>Une partie passe par plusieurs</w:t>
-      </w:r>
-      <w:r>
-        <w:t xml:space="preserve"> étapes, et c’est le Game Master qui la fait avancer.</w:t>
+        <w:t>Une partie passe par plusieurs étapes, et c’est le Game Master qui la fait avancer.</w:t>
       </w:r>
     </w:p>
     <w:p>
@@ -894,10 +866,7 @@
         <w:t>Pause</w:t>
       </w:r>
       <w:r>
-        <w:t xml:space="preserve"> (si besoin). Plus rien ne</w:t>
-      </w:r>
-      <w:r>
-        <w:t xml:space="preserve"> bouge, et les minuteurs sont suspendus jusqu’à la reprise.</w:t>
+        <w:t xml:space="preserve"> (si besoin). Plus rien ne bouge, et les minuteurs sont suspendus jusqu’à la reprise.</w:t>
       </w:r>
     </w:p>
     <w:p>
@@ -945,10 +914,7 @@
         <w:pStyle w:val="Titre1"/>
       </w:pPr>
       <w:r>
-        <w:t>4. Rej</w:t>
-      </w:r>
-      <w:r>
-        <w:t>oindre la partie</w:t>
+        <w:t>4. Rejoindre la partie</w:t>
       </w:r>
     </w:p>
     <w:p>
@@ -964,10 +930,7 @@
         <w:spacing w:after="120" w:line="300" w:lineRule="auto"/>
       </w:pPr>
       <w:r>
-        <w:t>Le joueur scanne le QR code d’accueil. L’application s’ouvre directement dans le navigateur du téléphone, sans rien installer (on peut l’ajouter à son écran d’accueil si on veut). Il choisit un pseudo et autorise la géolocalisat</w:t>
-      </w:r>
-      <w:r>
-        <w:t>ion, indispensable pour jouer. Un téléphone correspond à un seul joueur.</w:t>
+        <w:t>Le joueur scanne le QR code d’accueil. L’application s’ouvre directement dans le navigateur du téléphone, sans rien installer (on peut l’ajouter à son écran d’accueil si on veut). Il choisit un pseudo et autorise la géolocalisation, indispensable pour jouer. Un téléphone correspond à un seul joueur.</w:t>
       </w:r>
     </w:p>
     <w:p>
@@ -990,17 +953,8 @@
           <w:b/>
           <w:bCs/>
         </w:rPr>
-        <w:t xml:space="preserve">50 </w:t>
-      </w:r>
-      <w:proofErr w:type="gramStart"/>
-      <w:r>
-        <w:rPr>
-          <w:b/>
-          <w:bCs/>
-        </w:rPr>
-        <w:t>jenny</w:t>
-      </w:r>
-      <w:proofErr w:type="gramEnd"/>
+        <w:t>50 jenny</w:t>
+      </w:r>
       <w:r>
         <w:t xml:space="preserve"> (la monnaie du jeu) et </w:t>
       </w:r>
@@ -1012,10 +966,7 @@
         <w:t>un sort</w:t>
       </w:r>
       <w:r>
-        <w:t xml:space="preserve"> tiré au hasard. Un joueur qui arrive en retard reçoit en plus un petit bonus pour compenser le temps perd</w:t>
-      </w:r>
-      <w:r>
-        <w:t>u.</w:t>
+        <w:t xml:space="preserve"> tiré au hasard. Un joueur qui arrive en retard reçoit en plus un petit bonus pour compenser le temps perdu.</w:t>
       </w:r>
     </w:p>
     <w:p>
@@ -1031,15 +982,7 @@
         <w:spacing w:after="120" w:line="300" w:lineRule="auto"/>
       </w:pPr>
       <w:r>
-        <w:t xml:space="preserve">Trois questions de culture générale sur l’univers du jeu. C’est facultatif et on peut le passer plus tard. Chaque bonne réponse rapporte 10 </w:t>
-      </w:r>
-      <w:proofErr w:type="gramStart"/>
-      <w:r>
-        <w:t>jenny</w:t>
-      </w:r>
-      <w:proofErr w:type="gramEnd"/>
-      <w:r>
-        <w:t>.</w:t>
+        <w:t>Trois questions de culture générale sur l’univers du jeu. C’est facultatif et on peut le passer plus tard. Chaque bonne réponse rapporte 10 jenny.</w:t>
       </w:r>
     </w:p>
     <w:p>
@@ -1055,10 +998,7 @@
         <w:spacing w:after="120" w:line="300" w:lineRule="auto"/>
       </w:pPr>
       <w:r>
-        <w:t xml:space="preserve">Cinq questions de personnalité révèlent le type de Nen du joueur. C’est un </w:t>
-      </w:r>
-      <w:r>
-        <w:t>petit pouvoir qui l’accompagne toute la partie. Une fois utilisé, il se recharge au bout d’un certain temps, si bien que chaque joueur peut s’en servir plusieurs fois.</w:t>
+        <w:t>Cinq questions de personnalité révèlent le type de Nen du joueur. C’est un petit pouvoir qui l’accompagne toute la partie. Une fois utilisé, il se recharge au bout d’un certain temps, si bien que chaque joueur peut s’en servir plusieurs fois.</w:t>
       </w:r>
     </w:p>
     <w:tbl>
@@ -1108,6 +1048,7 @@
                 <w:b/>
                 <w:bCs/>
               </w:rPr>
+              <w:lastRenderedPageBreak/>
               <w:t>Type de Nen</w:t>
             </w:r>
           </w:p>
@@ -1196,6 +1137,15 @@
               <w:t>Annule le prochain sort offensif reçu (se recharge en 30 minutes)</w:t>
             </w:r>
           </w:p>
+          <w:p/>
+          <w:p/>
+          <w:p/>
+          <w:p/>
+          <w:p/>
+          <w:p/>
+          <w:p/>
+          <w:p/>
+          <w:p/>
         </w:tc>
       </w:tr>
       <w:tr>
@@ -1251,6 +1201,12 @@
               <w:t>Peut lancer un sort offensif sur un joueur éloigné (se recharge en 40 minutes)</w:t>
             </w:r>
           </w:p>
+          <w:p/>
+          <w:p/>
+          <w:p/>
+          <w:p/>
+          <w:p/>
+          <w:p/>
         </w:tc>
       </w:tr>
       <w:tr>
@@ -1306,6 +1262,9 @@
               <w:t>Peut déguiser un doublon en une autre carte, ce qui crée une fausse carte (toutes les 20 minutes)</w:t>
             </w:r>
           </w:p>
+          <w:p/>
+          <w:p/>
+          <w:p/>
         </w:tc>
       </w:tr>
       <w:tr>
@@ -1333,7 +1292,6 @@
               <w:spacing w:line="270" w:lineRule="auto"/>
             </w:pPr>
             <w:r>
-              <w:lastRenderedPageBreak/>
               <w:t>Matérialisation</w:t>
             </w:r>
           </w:p>
@@ -1414,10 +1372,7 @@
               <w:spacing w:line="270" w:lineRule="auto"/>
             </w:pPr>
             <w:r>
-              <w:t>Un échange forcé sans carte d</w:t>
-            </w:r>
-            <w:r>
-              <w:t>e sort (se recharge en 40 minutes)</w:t>
+              <w:t>Un échange forcé sans carte de sort (se recharge en 40 minutes)</w:t>
             </w:r>
           </w:p>
         </w:tc>
@@ -1488,10 +1443,7 @@
         <w:spacing w:after="120" w:line="300" w:lineRule="auto"/>
       </w:pPr>
       <w:r>
-        <w:t>Le Spécialiste découvre son pouvoir au test de Nen. Les autres joueurs ne le connaissent pas ; seule l’</w:t>
-      </w:r>
-      <w:r>
-        <w:t>équipe le voit.</w:t>
+        <w:t>Le Spécialiste découvre son pouvoir au test de Nen. Les autres joueurs ne le connaissent pas ; seule l’équipe le voit.</w:t>
       </w:r>
     </w:p>
     <w:tbl>
@@ -1681,10 +1633,7 @@
               <w:spacing w:line="270" w:lineRule="auto"/>
             </w:pPr>
             <w:r>
-              <w:t xml:space="preserve">Vole un joueur proche sans carte de sort, en visant la carte de son choix (jamais la </w:t>
-            </w:r>
-            <w:r>
-              <w:t>SS) ; si la cible ne l’a pas, il prend une carte au hasard</w:t>
+              <w:t>Vole un joueur proche sans carte de sort, en visant la carte de son choix (jamais la SS) ; si la cible ne l’a pas, il prend une carte au hasard</w:t>
             </w:r>
           </w:p>
         </w:tc>
@@ -1713,11 +1662,10 @@
             <w:pPr>
               <w:spacing w:line="270" w:lineRule="auto"/>
             </w:pPr>
-            <w:proofErr w:type="spellStart"/>
-            <w:r>
+            <w:r>
+              <w:lastRenderedPageBreak/>
               <w:t>Zetsu</w:t>
             </w:r>
-            <w:proofErr w:type="spellEnd"/>
           </w:p>
         </w:tc>
         <w:tc>
@@ -1807,10 +1755,7 @@
         <w:pStyle w:val="Titre1"/>
       </w:pPr>
       <w:r>
-        <w:t>5. Les ca</w:t>
-      </w:r>
-      <w:r>
-        <w:t>rtes et le Livre</w:t>
+        <w:t>5. Les cartes et le Livre</w:t>
       </w:r>
     </w:p>
     <w:p>
@@ -1826,29 +1771,14 @@
         <w:spacing w:after="120" w:line="300" w:lineRule="auto"/>
       </w:pPr>
       <w:r>
-        <w:t xml:space="preserve">Chaque partie </w:t>
-      </w:r>
-      <w:proofErr w:type="spellStart"/>
-      <w:r>
-        <w:t>a</w:t>
-      </w:r>
-      <w:proofErr w:type="spellEnd"/>
-      <w:r>
-        <w:t xml:space="preserve"> sa liste de cartes, numérotées à partir de 001. L’organisation choisit combien il y en a, selon la durée et le nombre de joueurs, pour qu’un Clear reste possible mais difficile. Le conseil donné par l’outil : </w:t>
+        <w:t xml:space="preserve">Chaque partie a sa liste de cartes, numérotées à partir de 001. L’organisation choisit combien il y en a, selon la durée et le nombre de joueurs, pour qu’un Clear reste possible mais difficile. Le conseil donné par l’outil : </w:t>
       </w:r>
       <w:r>
         <w:rPr>
           <w:b/>
           <w:bCs/>
         </w:rPr>
-        <w:t>1</w:t>
-      </w:r>
-      <w:r>
-        <w:rPr>
-          <w:b/>
-          <w:bCs/>
-        </w:rPr>
-        <w:t>2 cartes pour 1 h 30, puis 2 de plus par demi-heure</w:t>
+        <w:t>12 cartes pour 1 h 30, puis 2 de plus par demi-heure</w:t>
       </w:r>
       <w:r>
         <w:t xml:space="preserve"> (14 cartes pour 2 heures), et 2 de plus au-delà de 50 joueurs.</w:t>
@@ -2300,7 +2230,6 @@
         <w:pStyle w:val="Titre2"/>
       </w:pPr>
       <w:r>
-        <w:lastRenderedPageBreak/>
         <w:t>Le Livre</w:t>
       </w:r>
     </w:p>
@@ -2309,10 +2238,7 @@
         <w:spacing w:after="120" w:line="300" w:lineRule="auto"/>
       </w:pPr>
       <w:r>
-        <w:t xml:space="preserve">Le Livre, c’est la collection du joueur dans l’application. Il contient une place réservée pour chaque carte du catalogue, plus 15 places libres pour les doublons et les sorts, et une petite section à part de 8 places pour les objets. On le feuillette par </w:t>
-      </w:r>
-      <w:r>
-        <w:t>pages de 10. Quand les 15 places libres sont prises, le Livre est plein : il faut revendre ou échanger avant de pouvoir scanner à nouveau.</w:t>
+        <w:t>Le Livre, c’est la collection du joueur dans l’application. Il contient une place réservée pour chaque carte du catalogue, plus 15 places libres pour les doublons et les sorts, et une petite section à part de 8 places pour les objets. On le feuillette par pages de 10. Quand les 15 places libres sont prises, le Livre est plein : il faut revendre ou échanger avant de pouvoir scanner à nouveau.</w:t>
       </w:r>
     </w:p>
     <w:p>
@@ -2320,26 +2246,7 @@
         <w:spacing w:after="120" w:line="300" w:lineRule="auto"/>
       </w:pPr>
       <w:r>
-        <w:t xml:space="preserve">Chaque carte garde son histoire : on sait d’où elle vient (« Échange avec </w:t>
-      </w:r>
-      <w:proofErr w:type="spellStart"/>
-      <w:r>
-        <w:t>Kirua</w:t>
-      </w:r>
-      <w:proofErr w:type="spellEnd"/>
-      <w:r>
-        <w:t xml:space="preserve"> », « Checkpoint</w:t>
-      </w:r>
-      <w:proofErr w:type="gramStart"/>
-      <w:r>
-        <w:t xml:space="preserve"> »…</w:t>
-      </w:r>
-      <w:proofErr w:type="gramEnd"/>
-      <w:r>
-        <w:t>). Une carte perdue</w:t>
-      </w:r>
-      <w:r>
-        <w:t xml:space="preserve"> laisse une trace à sa place, par exemple « Volée par Gon à 14h05 ».</w:t>
+        <w:t>Chaque carte garde son histoire : on sait d’où elle vient (« Échange avec Kirua », « Checkpoint »…). Une carte perdue laisse une trace à sa place, par exemple « Volée par Gon à 14h05 ».</w:t>
       </w:r>
     </w:p>
     <w:p>
@@ -2355,10 +2262,7 @@
         <w:spacing w:after="120" w:line="300" w:lineRule="auto"/>
       </w:pPr>
       <w:r>
-        <w:t>Chaque carte n’existe qu’en un nombre limité d’exemplaires, qui dépend du nombre de joueurs présents. Quand une carte atteint sa limite, elle ne sort plus des bali</w:t>
-      </w:r>
-      <w:r>
-        <w:t>ses. Il faut alors l’obtenir auprès d’un autre joueur.</w:t>
+        <w:t>Chaque carte n’existe qu’en un nombre limité d’exemplaires, qui dépend du nombre de joueurs présents. Quand une carte atteint sa limite, elle ne sort plus des balises. Il faut alors l’obtenir auprès d’un autre joueur.</w:t>
       </w:r>
     </w:p>
     <w:p>
@@ -2394,10 +2298,7 @@
         <w:t>dorment</w:t>
       </w:r>
       <w:r>
-        <w:t>, et le joueur ne sait pas lesquelles. L’écran géant indique seulement combien de balises sont</w:t>
-      </w:r>
-      <w:r>
-        <w:t xml:space="preserve"> actives dans chaque zone.</w:t>
+        <w:t>, et le joueur ne sait pas lesquelles. L’écran géant indique seulement combien de balises sont actives dans chaque zone.</w:t>
       </w:r>
     </w:p>
     <w:p>
@@ -2405,6 +2306,7 @@
         <w:spacing w:after="120" w:line="300" w:lineRule="auto"/>
       </w:pPr>
       <w:r>
+        <w:lastRenderedPageBreak/>
         <w:t xml:space="preserve">Scanner une balise active déclenche un </w:t>
       </w:r>
       <w:r>
@@ -2415,18 +2317,7 @@
         <w:t>tirage</w:t>
       </w:r>
       <w:r>
-        <w:t xml:space="preserve"> : le plus souvent une carte (8 fois sur 10 environ), parfois un sort, plus rarement </w:t>
-      </w:r>
-      <w:proofErr w:type="gramStart"/>
-      <w:r>
-        <w:t>des jenny</w:t>
-      </w:r>
-      <w:proofErr w:type="gramEnd"/>
-      <w:r>
-        <w:t>. L’application répond toujours en clair, par exemple « Cette balise dort », « Plus rien i</w:t>
-      </w:r>
-      <w:r>
-        <w:t>ci, cherche ailleurs » ou « Attends encore 12 s ».</w:t>
+        <w:t xml:space="preserve"> : le plus souvent une carte (8 fois sur 10 environ), parfois un sort, plus rarement des jenny. L’application répond toujours en clair, par exemple « Cette balise dort », « Plus rien ici, cherche ailleurs » ou « Attends encore 12 s ».</w:t>
       </w:r>
     </w:p>
     <w:p>
@@ -2434,15 +2325,7 @@
         <w:spacing w:after="120" w:line="300" w:lineRule="auto"/>
       </w:pPr>
       <w:r>
-        <w:t xml:space="preserve">Quand la carte tirée n’est plus disponible (elle a atteint sa limite d’exemplaires), le joueur reçoit 10 </w:t>
-      </w:r>
-      <w:proofErr w:type="gramStart"/>
-      <w:r>
-        <w:t>jenny</w:t>
-      </w:r>
-      <w:proofErr w:type="gramEnd"/>
-      <w:r>
-        <w:t xml:space="preserve"> à la place, et une fois sur trois </w:t>
+        <w:t xml:space="preserve">Quand la carte tirée n’est plus disponible (elle a atteint sa limite d’exemplaires), le joueur reçoit 10 jenny à la place, et une fois sur trois </w:t>
       </w:r>
       <w:r>
         <w:rPr>
@@ -2473,10 +2356,7 @@
         <w:spacing w:after="80" w:line="290" w:lineRule="auto"/>
       </w:pPr>
       <w:r>
-        <w:t>I</w:t>
-      </w:r>
-      <w:r>
-        <w:t>l faut attendre 30 secondes entre deux scans.</w:t>
+        <w:t>Il faut attendre 30 secondes entre deux scans.</w:t>
       </w:r>
     </w:p>
     <w:p>
@@ -2515,10 +2395,7 @@
         <w:spacing w:after="80" w:line="290" w:lineRule="auto"/>
       </w:pPr>
       <w:r>
-        <w:t xml:space="preserve">Chaque balise a un stock. Une fois vide, elle </w:t>
-      </w:r>
-      <w:r>
-        <w:t>s’endort et une autre se réveille ailleurs. Toutes les 20 minutes, une partie des balises change.</w:t>
+        <w:t>Chaque balise a un stock. Une fois vide, elle s’endort et une autre se réveille ailleurs. Toutes les 20 minutes, une partie des balises change.</w:t>
       </w:r>
     </w:p>
     <w:p>
@@ -2534,15 +2411,7 @@
         <w:spacing w:after="120" w:line="300" w:lineRule="auto"/>
       </w:pPr>
       <w:r>
-        <w:t xml:space="preserve">Une balise qui se réveille </w:t>
-      </w:r>
-      <w:proofErr w:type="gramStart"/>
-      <w:r>
-        <w:t>a</w:t>
-      </w:r>
-      <w:proofErr w:type="gramEnd"/>
-      <w:r>
-        <w:t xml:space="preserve"> une chance sur sept environ d’être </w:t>
+        <w:t xml:space="preserve">Une balise qui se réveille a une chance sur sept environ d’être </w:t>
       </w:r>
       <w:r>
         <w:rPr>
@@ -2570,10 +2439,7 @@
         <w:spacing w:after="120" w:line="300" w:lineRule="auto"/>
       </w:pPr>
       <w:r>
-        <w:t>Si le réseau coupe au moment d’un scan, l’application le garde en mémoire et l’envoie au retour de la conne</w:t>
-      </w:r>
-      <w:r>
-        <w:t>xion (dans la limite de 10 minutes).</w:t>
+        <w:t>Si le réseau coupe au moment d’un scan, l’application le garde en mémoire et l’envoie au retour de la connexion (dans la limite de 10 minutes).</w:t>
       </w:r>
     </w:p>
     <w:p>
@@ -2581,7 +2447,6 @@
         <w:pStyle w:val="Titre1"/>
       </w:pPr>
       <w:r>
-        <w:lastRenderedPageBreak/>
         <w:t>7. Les sorts</w:t>
       </w:r>
     </w:p>
@@ -2725,10 +2590,7 @@
               <w:spacing w:line="270" w:lineRule="auto"/>
             </w:pPr>
             <w:r>
-              <w:t>Prend une carte au hasard à un joueur p</w:t>
-            </w:r>
-            <w:r>
-              <w:t>roche</w:t>
+              <w:t>Prend une carte au hasard à un joueur proche</w:t>
             </w:r>
           </w:p>
         </w:tc>
@@ -3184,6 +3046,7 @@
         <w:spacing w:after="120" w:line="300" w:lineRule="auto"/>
       </w:pPr>
       <w:r>
+        <w:lastRenderedPageBreak/>
         <w:t xml:space="preserve">Les sorts offensifs (Vol, Échange forcé, Gel) ne visent qu’un joueur </w:t>
       </w:r>
       <w:r>
@@ -3194,13 +3057,7 @@
         <w:t>à moins de 30 mètres</w:t>
       </w:r>
       <w:r>
-        <w:t xml:space="preserve">. L’application affiche la liste des joueurs </w:t>
-      </w:r>
-      <w:r>
-        <w:t xml:space="preserve">à portée, avec leur pseudo uniquement. Il faut attendre 2 minutes entre deux sorts offensifs, et un joueur touché est protégé pendant 5 minutes. La victime reçoit aussitôt une alerte qui dit qui l’a visée et avec quel sort. Tous les sorts apparaissent sur </w:t>
-      </w:r>
-      <w:r>
-        <w:t>l’écran géant.</w:t>
+        <w:t>. L’application affiche la liste des joueurs à portée, avec leur pseudo uniquement. Il faut attendre 2 minutes entre deux sorts offensifs, et un joueur touché est protégé pendant 5 minutes. La victime reçoit aussitôt une alerte qui dit qui l’a visée et avec quel sort. Tous les sorts apparaissent sur l’écran géant.</w:t>
       </w:r>
     </w:p>
     <w:p>
@@ -3215,10 +3072,7 @@
         <w:t>Regard</w:t>
       </w:r>
       <w:r>
-        <w:t xml:space="preserve"> est un sort d’information plus rare que les autres. Il ne marche que sur un joueur déjà croisé : quelqu’un qui a été à moins de 30 mètres au moins une fois, ou qu’on a visé avec un sort (ou qui nous a visé). On voit ses cartes telles </w:t>
-      </w:r>
-      <w:r>
-        <w:t>qu’elles paraissent, fausses cartes comprises. Le joueur regardé est prévenu que quelqu’un a consulté son Livre, sans savoir qui. C’est le meilleur moyen de savoir qui détient la SS.</w:t>
+        <w:t xml:space="preserve"> est un sort d’information plus rare que les autres. Il ne marche que sur un joueur déjà croisé : quelqu’un qui a été à moins de 30 mètres au moins une fois, ou qu’on a visé avec un sort (ou qui nous a visé). On voit ses cartes telles qu’elles paraissent, fausses cartes comprises. Le joueur regardé est prévenu que quelqu’un a consulté son Livre, sans savoir qui. C’est le meilleur moyen de savoir qui détient la SS.</w:t>
       </w:r>
     </w:p>
     <w:p>
@@ -3226,10 +3080,7 @@
         <w:spacing w:after="120" w:line="300" w:lineRule="auto"/>
       </w:pPr>
       <w:r>
-        <w:t>Couper son GPS ne protège pas : un joueur qui disparaît reste ciblable pe</w:t>
-      </w:r>
-      <w:r>
-        <w:t>ndant 10 minutes à sa dernière position connue, et l’équipe est prévenue.</w:t>
+        <w:t>Couper son GPS ne protège pas : un joueur qui disparaît reste ciblable pendant 10 minutes à sa dernière position connue, et l’équipe est prévenue.</w:t>
       </w:r>
     </w:p>
     <w:p>
@@ -3245,10 +3096,7 @@
         <w:spacing w:after="120" w:line="300" w:lineRule="auto"/>
       </w:pPr>
       <w:r>
-        <w:t>Les objets forment une troisième famille de cartes, à côté des cartes de collection et des sorts. Ils ne comptent pas pour le Clear. Ce sont des outils : on les utilise</w:t>
-      </w:r>
-      <w:r>
-        <w:t xml:space="preserve"> sur soi ou sur le terrain, ou on les revend. Contrairement aux sorts, ils sont discrets et n’apparaissent pas sur l’écran géant.</w:t>
+        <w:t>Les objets forment une troisième famille de cartes, à côté des cartes de collection et des sorts. Ils ne comptent pas pour le Clear. Ce sont des outils : on les utilise sur soi ou sur le terrain, ou on les revend. Contrairement aux sorts, ils sont discrets et n’apparaissent pas sur l’écran géant.</w:t>
       </w:r>
     </w:p>
     <w:p>
@@ -3256,22 +3104,7 @@
         <w:spacing w:after="120" w:line="300" w:lineRule="auto"/>
       </w:pPr>
       <w:r>
-        <w:t xml:space="preserve">On les obtient surtout quand une balise ou l’arène tombe sur une carte qui n’est plus disponible : en plus des 10 </w:t>
-      </w:r>
-      <w:proofErr w:type="gramStart"/>
-      <w:r>
-        <w:t>jenny habitu</w:t>
-      </w:r>
-      <w:r>
-        <w:t>els</w:t>
-      </w:r>
-      <w:proofErr w:type="gramEnd"/>
-      <w:r>
-        <w:t xml:space="preserve">, le joueur reçoit un objet une fois sur trois. Chaque joueur en trouve </w:t>
-      </w:r>
-      <w:r>
-        <w:lastRenderedPageBreak/>
-        <w:t>deux ou trois par partie. Ils se rangent dans une section à part du Livre (8 places), s’échangent comme des cartes, mais ne peuvent pas être volés.</w:t>
+        <w:t>On les obtient surtout quand une balise ou l’arène tombe sur une carte qui n’est plus disponible : en plus des 10 jenny habituels, le joueur reçoit un objet une fois sur trois. Chaque joueur en trouve deux ou trois par partie. Ils se rangent dans une section à part du Livre (8 places), s’échangent comme des cartes, mais ne peuvent pas être volés.</w:t>
       </w:r>
     </w:p>
     <w:tbl>
@@ -3406,23 +3239,7 @@
               <w:spacing w:line="270" w:lineRule="auto"/>
             </w:pPr>
             <w:r>
-              <w:t xml:space="preserve">Se revend 30 </w:t>
-            </w:r>
-            <w:proofErr w:type="gramStart"/>
-            <w:r>
-              <w:t>jenny</w:t>
-            </w:r>
-            <w:proofErr w:type="gramEnd"/>
-            <w:r>
-              <w:t xml:space="preserve"> à </w:t>
-            </w:r>
-            <w:proofErr w:type="spellStart"/>
-            <w:r>
-              <w:t>Masadora</w:t>
-            </w:r>
-            <w:proofErr w:type="spellEnd"/>
-            <w:r>
-              <w:t xml:space="preserve"> (une réserve d’argent qu’on peut aussi échanger)</w:t>
+              <w:t>Se revend 30 jenny à Masadora (une réserve d’argent qu’on peut aussi échanger)</w:t>
             </w:r>
           </w:p>
         </w:tc>
@@ -3477,13 +3294,8 @@
               <w:spacing w:line="270" w:lineRule="auto"/>
             </w:pPr>
             <w:r>
-              <w:t xml:space="preserve">À gratter dans l’application : 0, 10, 30 ou 100 </w:t>
-            </w:r>
-            <w:proofErr w:type="gramStart"/>
-            <w:r>
-              <w:t>jenny</w:t>
-            </w:r>
-            <w:proofErr w:type="gramEnd"/>
+              <w:t>À gratter dans l’application : 0, 10, 30 ou 100 jenny</w:t>
+            </w:r>
           </w:p>
         </w:tc>
       </w:tr>
@@ -3647,10 +3459,7 @@
               <w:spacing w:line="270" w:lineRule="auto"/>
             </w:pPr>
             <w:r>
-              <w:t>Agit to</w:t>
-            </w:r>
-            <w:r>
-              <w:t>ut seul : bloque le prochain Radar ou Regard lancé sur soi</w:t>
+              <w:t>Agit tout seul : bloque le prochain Radar ou Regard lancé sur soi</w:t>
             </w:r>
           </w:p>
         </w:tc>
@@ -3721,18 +3530,7 @@
         <w:spacing w:after="120" w:line="300" w:lineRule="auto"/>
       </w:pPr>
       <w:r>
-        <w:t xml:space="preserve">Les objets ont été testés dans le simulateur : donnés en plus </w:t>
-      </w:r>
-      <w:proofErr w:type="gramStart"/>
-      <w:r>
-        <w:t>des jen</w:t>
-      </w:r>
-      <w:r>
-        <w:t>ny</w:t>
-      </w:r>
-      <w:proofErr w:type="gramEnd"/>
-      <w:r>
-        <w:t>, ils ne rendent pas le Clear plus difficile et l’aident même un peu dans les grands groupes.</w:t>
+        <w:t>Les objets ont été testés dans le simulateur : donnés en plus des jenny, ils ne rendent pas le Clear plus difficile et l’aident même un peu dans les grands groupes.</w:t>
       </w:r>
     </w:p>
     <w:p>
@@ -3740,6 +3538,7 @@
         <w:pStyle w:val="Titre1"/>
       </w:pPr>
       <w:r>
+        <w:lastRenderedPageBreak/>
         <w:t>9. Les lieux et les arbitres</w:t>
       </w:r>
     </w:p>
@@ -3748,23 +3547,15 @@
         <w:spacing w:after="120" w:line="300" w:lineRule="auto"/>
       </w:pPr>
       <w:r>
-        <w:t>Le terrain compte des zones « sauvages » où se trouvent les balises, et trois lieux spéciaux, chacun tenu par un arbitre et doté d’</w:t>
-      </w:r>
-      <w:r>
-        <w:t>un QR code affiché sur place. Le scanner prouve que le joueur est bien là.</w:t>
+        <w:t>Le terrain compte des zones « sauvages » où se trouvent les balises, et trois lieux spéciaux, chacun tenu par un arbitre et doté d’un QR code affiché sur place. Le scanner prouve que le joueur est bien là.</w:t>
       </w:r>
     </w:p>
     <w:p>
       <w:pPr>
         <w:pStyle w:val="Titre2"/>
       </w:pPr>
-      <w:proofErr w:type="spellStart"/>
-      <w:r>
-        <w:t>Masadora</w:t>
-      </w:r>
-      <w:proofErr w:type="spellEnd"/>
-      <w:r>
-        <w:t>, la boutique</w:t>
+      <w:r>
+        <w:t>Masadora, la boutique</w:t>
       </w:r>
     </w:p>
     <w:p>
@@ -3772,47 +3563,15 @@
         <w:spacing w:after="120" w:line="300" w:lineRule="auto"/>
       </w:pPr>
       <w:r>
-        <w:t xml:space="preserve">On y achète des paquets de 3 sorts (50 </w:t>
-      </w:r>
-      <w:proofErr w:type="gramStart"/>
-      <w:r>
-        <w:t>jenny</w:t>
-      </w:r>
-      <w:proofErr w:type="gramEnd"/>
-      <w:r>
-        <w:t xml:space="preserve">), avec un nombre de paquets limité toutes les 20 minutes. On peut aussi y revendre ses cartes : 5 </w:t>
-      </w:r>
-      <w:proofErr w:type="gramStart"/>
-      <w:r>
-        <w:t>jenny</w:t>
-      </w:r>
-      <w:proofErr w:type="gramEnd"/>
-      <w:r>
-        <w:t xml:space="preserve"> pour une D, jusqu’à 80 jenny pour une S. La SS ne se revend pas. Les objets se revendent aussi : 30 </w:t>
-      </w:r>
-      <w:proofErr w:type="gramStart"/>
-      <w:r>
-        <w:t>jenny</w:t>
-      </w:r>
-      <w:proofErr w:type="gramEnd"/>
-      <w:r>
-        <w:t xml:space="preserve"> p</w:t>
-      </w:r>
-      <w:r>
-        <w:t>our une Pépite d’or, 10 jenny pour les autres (le Ticket, lui, se gratte).</w:t>
+        <w:t>On y achète des paquets de 3 sorts (50 jenny), avec un nombre de paquets limité toutes les 20 minutes. On peut aussi y revendre ses cartes : 5 jenny pour une D, jusqu’à 80 jenny pour une S. La SS ne se revend pas. Les objets se revendent aussi : 30 jenny pour une Pépite d’or, 10 jenny pour les autres (le Ticket, lui, se gratte).</w:t>
       </w:r>
     </w:p>
     <w:p>
       <w:pPr>
         <w:pStyle w:val="Titre2"/>
       </w:pPr>
-      <w:proofErr w:type="spellStart"/>
-      <w:r>
-        <w:t>Antokiba</w:t>
-      </w:r>
-      <w:proofErr w:type="spellEnd"/>
-      <w:r>
-        <w:t>, les enchères</w:t>
+      <w:r>
+        <w:t>Antokiba, les enchères</w:t>
       </w:r>
     </w:p>
     <w:p>
@@ -3820,31 +3579,15 @@
         <w:spacing w:after="120" w:line="300" w:lineRule="auto"/>
       </w:pPr>
       <w:r>
-        <w:t>L’arbitre met une carte aux enchères pendant 3 minutes, y compris parfois la SS. Les joueurs présents scannent le QR de l’enchère, puis surenchérissent dans l</w:t>
-      </w:r>
-      <w:r>
-        <w:t xml:space="preserve">’application. Seul le gagnant paie. On peut aussi y faire expertiser son Livre pour y trouver les fausses cartes (10 </w:t>
-      </w:r>
-      <w:proofErr w:type="gramStart"/>
-      <w:r>
-        <w:t>jenny</w:t>
-      </w:r>
-      <w:proofErr w:type="gramEnd"/>
-      <w:r>
-        <w:t xml:space="preserve"> la page, 25 jenny le Livre entier).</w:t>
+        <w:t>L’arbitre met une carte aux enchères pendant 3 minutes, y compris parfois la SS. Les joueurs présents scannent le QR de l’enchère, puis surenchérissent dans l’application. Seul le gagnant paie. On peut aussi y faire expertiser son Livre pour y trouver les fausses cartes (10 jenny la page, 25 jenny le Livre entier).</w:t>
       </w:r>
     </w:p>
     <w:p>
       <w:pPr>
         <w:pStyle w:val="Titre2"/>
       </w:pPr>
-      <w:proofErr w:type="spellStart"/>
-      <w:r>
-        <w:t>Soufrabi</w:t>
-      </w:r>
-      <w:proofErr w:type="spellEnd"/>
-      <w:r>
-        <w:t>, l’arène</w:t>
+      <w:r>
+        <w:t>Soufrabi, l’arène</w:t>
       </w:r>
     </w:p>
     <w:p>
@@ -3852,18 +3595,7 @@
         <w:spacing w:after="120" w:line="300" w:lineRule="auto"/>
       </w:pPr>
       <w:r>
-        <w:t xml:space="preserve">Le joueur paie une mise de 30 </w:t>
-      </w:r>
-      <w:proofErr w:type="gramStart"/>
-      <w:r>
-        <w:t>jenny</w:t>
-      </w:r>
-      <w:proofErr w:type="gramEnd"/>
-      <w:r>
-        <w:t xml:space="preserve"> et relève un défi physique ou d’adresse arb</w:t>
-      </w:r>
-      <w:r>
-        <w:t>itré sur place. En cas de victoire, il gagne une carte de haut rang (A, S, ou la SS avec un peu de chance). En cas de défaite, il perd sa mise. On peut retenter toutes les 15 minutes.</w:t>
+        <w:t>Le joueur paie une mise de 30 jenny et relève un défi physique ou d’adresse arbitré sur place. En cas de victoire, il gagne une carte de haut rang (A, S, ou la SS avec un peu de chance). En cas de défaite, il perd sa mise. On peut retenter toutes les 15 minutes.</w:t>
       </w:r>
     </w:p>
     <w:p>
@@ -3871,7 +3603,6 @@
         <w:pStyle w:val="Titre2"/>
       </w:pPr>
       <w:r>
-        <w:lastRenderedPageBreak/>
         <w:t>Les checkpoints</w:t>
       </w:r>
     </w:p>
@@ -3880,10 +3611,7 @@
         <w:spacing w:after="120" w:line="300" w:lineRule="auto"/>
       </w:pPr>
       <w:r>
-        <w:t>Ailleurs sur le terrain, des arbitres proposent des défi</w:t>
-      </w:r>
-      <w:r>
-        <w:t>s : énigmes, épreuves, questions. Celui qui réussit reçoit une carte du stock de l’arbitre et/ou des jenny. L’outil conseille environ un checkpoint pour 10 joueurs.</w:t>
+        <w:t>Ailleurs sur le terrain, des arbitres proposent des défis : énigmes, épreuves, questions. Celui qui réussit reçoit une carte du stock de l’arbitre et/ou des jenny. L’outil conseille environ un checkpoint pour 10 joueurs.</w:t>
       </w:r>
     </w:p>
     <w:p>
@@ -3909,10 +3637,7 @@
         <w:t>licence</w:t>
       </w:r>
       <w:r>
-        <w:t xml:space="preserve"> : un QR code personnel dans</w:t>
-      </w:r>
-      <w:r>
-        <w:t xml:space="preserve"> l’application, qui change toutes les 30 secondes. L’arbitre le scanne pour savoir à qui il a affaire. Comme le code change sans arrêt, une capture d’écran envoyée à un ami ne sert à rien.</w:t>
+        <w:t xml:space="preserve"> : un QR code personnel dans l’application, qui change toutes les 30 secondes. L’arbitre le scanne pour savoir à qui il a affaire. Comme le code change sans arrêt, une capture d’écran envoyée à un ami ne sert à rien.</w:t>
       </w:r>
     </w:p>
     <w:p>
@@ -3928,10 +3653,7 @@
         <w:spacing w:after="120" w:line="300" w:lineRule="auto"/>
       </w:pPr>
       <w:r>
-        <w:t>L’échange fonctionne un peu comme dans l</w:t>
-      </w:r>
-      <w:r>
-        <w:t>es jeux Pokémon.</w:t>
+        <w:t>L’échange fonctionne un peu comme dans les jeux Pokémon.</w:t>
       </w:r>
     </w:p>
     <w:p>
@@ -3991,10 +3713,8 @@
         <w:spacing w:after="120" w:line="300" w:lineRule="auto"/>
       </w:pPr>
       <w:r>
-        <w:t xml:space="preserve">Chacun doit donner au moins quelque chose : </w:t>
-      </w:r>
-      <w:r>
-        <w:t>on ne peut pas faire de cadeau gratuit. Deux mêmes joueurs ne peuvent échanger qu’une fois toutes les 10 minutes. Une carte reçue n’est pas vérifiée : elle peut être fausse.</w:t>
+        <w:lastRenderedPageBreak/>
+        <w:t>Chacun doit donner au moins quelque chose : on ne peut pas faire de cadeau gratuit. Deux mêmes joueurs ne peuvent échanger qu’une fois toutes les 10 minutes. Une carte reçue n’est pas vérifiée : elle peut être fausse.</w:t>
       </w:r>
     </w:p>
     <w:p>
@@ -4010,10 +3730,7 @@
         <w:spacing w:after="120" w:line="300" w:lineRule="auto"/>
       </w:pPr>
       <w:r>
-        <w:t>Le jeu permet de tromper les autres. Une fausse</w:t>
-      </w:r>
-      <w:r>
-        <w:t xml:space="preserve"> carte apparaît de deux façons :</w:t>
+        <w:t>Le jeu permet de tromper les autres. Une fausse carte apparaît de deux façons :</w:t>
       </w:r>
     </w:p>
     <w:p>
@@ -4025,13 +3742,8 @@
         </w:numPr>
         <w:spacing w:after="80" w:line="290" w:lineRule="auto"/>
       </w:pPr>
-      <w:proofErr w:type="gramStart"/>
-      <w:r>
-        <w:t>le</w:t>
-      </w:r>
-      <w:proofErr w:type="gramEnd"/>
-      <w:r>
-        <w:t xml:space="preserve"> sort </w:t>
+      <w:r>
+        <w:t xml:space="preserve">le sort </w:t>
       </w:r>
       <w:r>
         <w:rPr>
@@ -4053,13 +3765,8 @@
         </w:numPr>
         <w:spacing w:after="80" w:line="290" w:lineRule="auto"/>
       </w:pPr>
-      <w:proofErr w:type="gramStart"/>
-      <w:r>
-        <w:t>le</w:t>
-      </w:r>
-      <w:proofErr w:type="gramEnd"/>
-      <w:r>
-        <w:t xml:space="preserve"> pouvoir </w:t>
+      <w:r>
+        <w:t xml:space="preserve">le pouvoir </w:t>
       </w:r>
       <w:r>
         <w:rPr>
@@ -4077,21 +3784,7 @@
         <w:spacing w:after="120" w:line="300" w:lineRule="auto"/>
       </w:pPr>
       <w:r>
-        <w:t>Pour</w:t>
-      </w:r>
-      <w:r>
-        <w:t xml:space="preserve"> celui qui la reçoit, une fausse carte ressemble en tout point à une vraie. On ne la démasque qu’avec le sort Analyse ou une expertise à </w:t>
-      </w:r>
-      <w:proofErr w:type="spellStart"/>
-      <w:r>
-        <w:t>Antokiba</w:t>
-      </w:r>
-      <w:proofErr w:type="spellEnd"/>
-      <w:r>
-        <w:t>. Une fausse carte compte dans le classement affiché pendant la partie (rien ne la trahit), mais pas pour le Cl</w:t>
-      </w:r>
-      <w:r>
-        <w:t>ear ni pour le classement final.</w:t>
+        <w:t>Pour celui qui la reçoit, une fausse carte ressemble en tout point à une vraie. On ne la démasque qu’avec le sort Analyse ou une expertise à Antokiba. Une fausse carte compte dans le classement affiché pendant la partie (rien ne la trahit), mais pas pour le Clear ni pour le classement final.</w:t>
       </w:r>
     </w:p>
     <w:p>
@@ -4158,7 +3851,6 @@
                 <w:b/>
                 <w:bCs/>
               </w:rPr>
-              <w:lastRenderedPageBreak/>
               <w:t>Évènement</w:t>
             </w:r>
           </w:p>
@@ -4569,13 +4261,8 @@
               <w:spacing w:line="270" w:lineRule="auto"/>
             </w:pPr>
             <w:r>
-              <w:t xml:space="preserve">Krach de </w:t>
-            </w:r>
-            <w:proofErr w:type="spellStart"/>
-            <w:r>
-              <w:t>Masadora</w:t>
-            </w:r>
-            <w:proofErr w:type="spellEnd"/>
+              <w:t>Krach de Masadora</w:t>
+            </w:r>
           </w:p>
         </w:tc>
         <w:tc>
@@ -4599,10 +4286,7 @@
               <w:spacing w:line="270" w:lineRule="auto"/>
             </w:pPr>
             <w:r>
-              <w:t>La boutique est à m</w:t>
-            </w:r>
-            <w:r>
-              <w:t>oitié prix</w:t>
+              <w:t>La boutique est à moitié prix</w:t>
             </w:r>
           </w:p>
         </w:tc>
@@ -4682,15 +4366,7 @@
               <w:spacing w:line="270" w:lineRule="auto"/>
             </w:pPr>
             <w:r>
-              <w:t xml:space="preserve">Une carte piégée circule ; celui qui l’a à la fin </w:t>
-            </w:r>
-            <w:proofErr w:type="gramStart"/>
-            <w:r>
-              <w:t>perd</w:t>
-            </w:r>
-            <w:proofErr w:type="gramEnd"/>
-            <w:r>
-              <w:t xml:space="preserve"> 2 cartes au hasard</w:t>
+              <w:t>Une carte piégée circule ; celui qui l’a à la fin perd 2 cartes au hasard</w:t>
             </w:r>
           </w:p>
         </w:tc>
@@ -4822,13 +4498,11 @@
         <w:spacing w:after="120" w:line="300" w:lineRule="auto"/>
       </w:pPr>
       <w:r>
-        <w:t xml:space="preserve">Dès que le Livre d’un joueur est complet, il se fige (plus aucun sort ne peut le toucher) et le joueur doit aller voir le Game Master. Celui-ci </w:t>
-      </w:r>
-      <w:r>
-        <w:t xml:space="preserve">scanne sa licence et vérifie le Livre. S’il contient une fausse carte, le Clear est refusé : le joueur apprend sur quelle page se trouve le problème, mais pas quelle carte. S’il est confirmé, la partie s’arrête pour tout le monde. Le gagnant choisit alors </w:t>
-      </w:r>
-      <w:r>
-        <w:t>3 cartes de sa collection, qui deviennent ses lots réels.</w:t>
+        <w:t xml:space="preserve">Dès que le Livre d’un joueur est complet, il se fige (plus aucun sort ne peut le toucher) et le joueur doit aller voir le Game Master. Celui-ci scanne sa licence et vérifie le Livre. S’il contient une fausse carte, le Clear est refusé : le joueur apprend sur quelle page se trouve le problème, mais pas quelle </w:t>
+      </w:r>
+      <w:r>
+        <w:lastRenderedPageBreak/>
+        <w:t>carte. S’il est confirmé, la partie s’arrête pour tout le monde. Le gagnant choisit alors 3 cartes de sa collection, qui deviennent ses lots réels.</w:t>
       </w:r>
     </w:p>
     <w:p>
@@ -4852,10 +4526,7 @@
         <w:spacing w:after="120" w:line="300" w:lineRule="auto"/>
       </w:pPr>
       <w:r>
-        <w:t>Sans Clear, la partie s</w:t>
-      </w:r>
-      <w:r>
-        <w:t>e termine à l’heure prévue et le classement départage les joueurs, dans cet ordre :</w:t>
+        <w:t>Sans Clear, la partie se termine à l’heure prévue et le classement départage les joueurs, dans cet ordre :</w:t>
       </w:r>
     </w:p>
     <w:p>
@@ -4867,13 +4538,8 @@
         </w:numPr>
         <w:spacing w:after="80" w:line="290" w:lineRule="auto"/>
       </w:pPr>
-      <w:proofErr w:type="gramStart"/>
-      <w:r>
-        <w:t>le</w:t>
-      </w:r>
-      <w:proofErr w:type="gramEnd"/>
-      <w:r>
-        <w:t xml:space="preserve"> nombre de cartes différentes du catalogue réunies ;</w:t>
+      <w:r>
+        <w:t>le nombre de cartes différentes du catalogue réunies ;</w:t>
       </w:r>
     </w:p>
     <w:p>
@@ -4885,13 +4551,8 @@
         </w:numPr>
         <w:spacing w:after="80" w:line="290" w:lineRule="auto"/>
       </w:pPr>
-      <w:proofErr w:type="gramStart"/>
-      <w:r>
-        <w:t>la</w:t>
-      </w:r>
-      <w:proofErr w:type="gramEnd"/>
-      <w:r>
-        <w:t xml:space="preserve"> valeur de ces cartes (SS vaut 6 points, S 5, A 4, B 3, C 2, D 1) ;</w:t>
+      <w:r>
+        <w:t>la valeur de ces cartes (SS vaut 6 points, S 5, A 4, B 3, C 2, D 1) ;</w:t>
       </w:r>
     </w:p>
     <w:p>
@@ -4903,13 +4564,8 @@
         </w:numPr>
         <w:spacing w:after="80" w:line="290" w:lineRule="auto"/>
       </w:pPr>
-      <w:proofErr w:type="gramStart"/>
-      <w:r>
-        <w:t>les</w:t>
-      </w:r>
-      <w:proofErr w:type="gramEnd"/>
-      <w:r>
-        <w:t xml:space="preserve"> jenny restants ;</w:t>
+      <w:r>
+        <w:t>les jenny restants ;</w:t>
       </w:r>
     </w:p>
     <w:p>
@@ -4921,13 +4577,8 @@
         </w:numPr>
         <w:spacing w:after="80" w:line="290" w:lineRule="auto"/>
       </w:pPr>
-      <w:proofErr w:type="gramStart"/>
-      <w:r>
-        <w:t>l’heure</w:t>
-      </w:r>
-      <w:proofErr w:type="gramEnd"/>
-      <w:r>
-        <w:t xml:space="preserve"> de la dernière carte obtenue (le plus rapide l’emporte).</w:t>
+      <w:r>
+        <w:t>l’heure de la dernière carte obtenue (le plus rapide l’emporte).</w:t>
       </w:r>
     </w:p>
     <w:p>
@@ -4935,10 +4586,7 @@
         <w:spacing w:after="120" w:line="300" w:lineRule="auto"/>
       </w:pPr>
       <w:r>
-        <w:t>Les trois premiers montent sur le podium et reçoivent les lots prévus par l’organisateur, en plus d’</w:t>
-      </w:r>
-      <w:r>
-        <w:t>un éventuel Clear.</w:t>
+        <w:t>Les trois premiers montent sur le podium et reçoivent les lots prévus par l’organisateur, en plus d’un éventuel Clear.</w:t>
       </w:r>
     </w:p>
     <w:p>
@@ -4946,7 +4594,6 @@
         <w:pStyle w:val="Titre1"/>
       </w:pPr>
       <w:r>
-        <w:lastRenderedPageBreak/>
         <w:t>14. Fair-play et triche</w:t>
       </w:r>
     </w:p>
@@ -4963,10 +4610,7 @@
         <w:spacing w:after="120" w:line="300" w:lineRule="auto"/>
       </w:pPr>
       <w:r>
-        <w:t>Le système repère</w:t>
-      </w:r>
-      <w:r>
-        <w:t xml:space="preserve"> les comportements suspects et alerte l’équipe, qui décide. Il ne sanctionne jamais seul. Les alertes portent sur :</w:t>
+        <w:t>Le système repère les comportements suspects et alerte l’équipe, qui décide. Il ne sanctionne jamais seul. Les alertes portent sur :</w:t>
       </w:r>
     </w:p>
     <w:p>
@@ -4978,13 +4622,8 @@
         </w:numPr>
         <w:spacing w:after="80" w:line="290" w:lineRule="auto"/>
       </w:pPr>
-      <w:proofErr w:type="gramStart"/>
-      <w:r>
-        <w:t>une</w:t>
-      </w:r>
-      <w:proofErr w:type="gramEnd"/>
-      <w:r>
-        <w:t xml:space="preserve"> même balise scannée au même moment par deux joueurs éloignés (photo de balise partagée) ;</w:t>
+      <w:r>
+        <w:t>une même balise scannée au même moment par deux joueurs éloignés (photo de balise partagée) ;</w:t>
       </w:r>
     </w:p>
     <w:p>
@@ -4996,13 +4635,8 @@
         </w:numPr>
         <w:spacing w:after="80" w:line="290" w:lineRule="auto"/>
       </w:pPr>
-      <w:proofErr w:type="gramStart"/>
-      <w:r>
-        <w:t>un</w:t>
-      </w:r>
-      <w:proofErr w:type="gramEnd"/>
-      <w:r>
-        <w:t xml:space="preserve"> déplacement trop rapide (plus de 15 km/h) ;</w:t>
+      <w:r>
+        <w:t>un déplacement trop rapide (plus de 15 km/h) ;</w:t>
       </w:r>
     </w:p>
     <w:p>
@@ -5014,13 +4648,8 @@
         </w:numPr>
         <w:spacing w:after="80" w:line="290" w:lineRule="auto"/>
       </w:pPr>
-      <w:proofErr w:type="gramStart"/>
-      <w:r>
-        <w:t>une</w:t>
-      </w:r>
-      <w:proofErr w:type="gramEnd"/>
-      <w:r>
-        <w:t xml:space="preserve"> deuxième inscription depuis le même téléphone (bloquée) ;</w:t>
+      <w:r>
+        <w:t>une deuxième inscription depuis le même téléphone (bloquée) ;</w:t>
       </w:r>
     </w:p>
     <w:p>
@@ -5032,13 +4661,8 @@
         </w:numPr>
         <w:spacing w:after="80" w:line="290" w:lineRule="auto"/>
       </w:pPr>
-      <w:proofErr w:type="gramStart"/>
-      <w:r>
-        <w:t>des</w:t>
-      </w:r>
-      <w:proofErr w:type="gramEnd"/>
-      <w:r>
-        <w:t xml:space="preserve"> échanges répétés et déséquilibrés entre deux joueurs ;</w:t>
+      <w:r>
+        <w:t>des échanges répétés et déséquilibrés entre deux joueurs ;</w:t>
       </w:r>
     </w:p>
     <w:p>
@@ -5050,13 +4674,8 @@
         </w:numPr>
         <w:spacing w:after="80" w:line="290" w:lineRule="auto"/>
       </w:pPr>
-      <w:proofErr w:type="gramStart"/>
-      <w:r>
-        <w:t>un</w:t>
-      </w:r>
-      <w:proofErr w:type="gramEnd"/>
-      <w:r>
-        <w:t xml:space="preserve"> rythme de scan anormal ;</w:t>
+      <w:r>
+        <w:t>un rythme de scan anormal ;</w:t>
       </w:r>
     </w:p>
     <w:p>
@@ -5068,13 +4687,8 @@
         </w:numPr>
         <w:spacing w:after="80" w:line="290" w:lineRule="auto"/>
       </w:pPr>
-      <w:proofErr w:type="gramStart"/>
-      <w:r>
-        <w:t>un</w:t>
-      </w:r>
-      <w:proofErr w:type="gramEnd"/>
-      <w:r>
-        <w:t xml:space="preserve"> joueur qui ne donne plus sa position.</w:t>
+      <w:r>
+        <w:t>un joueur qui ne donne plus sa position.</w:t>
       </w:r>
     </w:p>
     <w:tbl>
@@ -5535,6 +5149,7 @@
               <w:spacing w:line="270" w:lineRule="auto"/>
             </w:pPr>
             <w:r>
+              <w:lastRenderedPageBreak/>
               <w:t>Plusieurs comptes</w:t>
             </w:r>
           </w:p>
@@ -5617,10 +5232,7 @@
         <w:spacing w:after="120" w:line="300" w:lineRule="auto"/>
       </w:pPr>
       <w:r>
-        <w:t>Installé près de l’accueil ou au centre du terrain, il fait vivre la partie pour les joueurs et l</w:t>
-      </w:r>
-      <w:r>
-        <w:t>e public :</w:t>
+        <w:t>Installé près de l’accueil ou au centre du terrain, il fait vivre la partie pour les joueurs et le public :</w:t>
       </w:r>
     </w:p>
     <w:p>
@@ -5632,13 +5244,8 @@
         </w:numPr>
         <w:spacing w:after="80" w:line="290" w:lineRule="auto"/>
       </w:pPr>
-      <w:proofErr w:type="gramStart"/>
-      <w:r>
-        <w:t>le</w:t>
-      </w:r>
-      <w:proofErr w:type="gramEnd"/>
-      <w:r>
-        <w:t xml:space="preserve"> classement en direct ;</w:t>
+      <w:r>
+        <w:t>le classement en direct ;</w:t>
       </w:r>
     </w:p>
     <w:p>
@@ -5650,13 +5257,8 @@
         </w:numPr>
         <w:spacing w:after="80" w:line="290" w:lineRule="auto"/>
       </w:pPr>
-      <w:proofErr w:type="gramStart"/>
-      <w:r>
-        <w:t>un</w:t>
-      </w:r>
-      <w:proofErr w:type="gramEnd"/>
-      <w:r>
-        <w:t xml:space="preserve"> fil d’actualité : belles cartes trouvées, sorts lancés, grands échanges, victoires à l’arène ;</w:t>
+      <w:r>
+        <w:t>un fil d’actualité : belles cartes trouvées, sorts lancés, grands échanges, victoires à l’arène ;</w:t>
       </w:r>
     </w:p>
     <w:p>
@@ -5668,13 +5270,8 @@
         </w:numPr>
         <w:spacing w:after="80" w:line="290" w:lineRule="auto"/>
       </w:pPr>
-      <w:proofErr w:type="gramStart"/>
-      <w:r>
-        <w:t>le</w:t>
-      </w:r>
-      <w:proofErr w:type="gramEnd"/>
-      <w:r>
-        <w:t xml:space="preserve"> nombre de balises actives par zone ;</w:t>
+      <w:r>
+        <w:t>le nombre de balises actives par zone ;</w:t>
       </w:r>
     </w:p>
     <w:p>
@@ -5686,16 +5283,8 @@
         </w:numPr>
         <w:spacing w:after="80" w:line="290" w:lineRule="auto"/>
       </w:pPr>
-      <w:proofErr w:type="gramStart"/>
-      <w:r>
-        <w:t>une</w:t>
-      </w:r>
-      <w:proofErr w:type="gramEnd"/>
-      <w:r>
-        <w:t xml:space="preserve"> carte de chaleur qui montre où se trouvent les joueurs, de façon anonyme et a</w:t>
-      </w:r>
-      <w:r>
-        <w:t>vec 2 minutes de décalage ;</w:t>
+      <w:r>
+        <w:t>une carte de chaleur qui montre où se trouvent les joueurs, de façon anonyme et avec 2 minutes de décalage ;</w:t>
       </w:r>
     </w:p>
     <w:p>
@@ -5707,13 +5296,8 @@
         </w:numPr>
         <w:spacing w:after="80" w:line="290" w:lineRule="auto"/>
       </w:pPr>
-      <w:proofErr w:type="gramStart"/>
-      <w:r>
-        <w:t>les</w:t>
-      </w:r>
-      <w:proofErr w:type="gramEnd"/>
-      <w:r>
-        <w:t xml:space="preserve"> évènements en cours avec leur compte à rebours, et la barre de vie du boss pendant un raid ;</w:t>
+      <w:r>
+        <w:t>les évènements en cours avec leur compte à rebours, et la barre de vie du boss pendant un raid ;</w:t>
       </w:r>
     </w:p>
     <w:p>
@@ -5725,13 +5309,8 @@
         </w:numPr>
         <w:spacing w:after="80" w:line="290" w:lineRule="auto"/>
       </w:pPr>
-      <w:proofErr w:type="gramStart"/>
-      <w:r>
-        <w:t>l’annonce</w:t>
-      </w:r>
-      <w:proofErr w:type="gramEnd"/>
-      <w:r>
-        <w:t xml:space="preserve"> du Clear en plein écran.</w:t>
+      <w:r>
+        <w:t>l’annonce du Clear en plein écran.</w:t>
       </w:r>
     </w:p>
     <w:p>
@@ -5739,7 +5318,6 @@
         <w:spacing w:after="120" w:line="300" w:lineRule="auto"/>
       </w:pPr>
       <w:r>
-        <w:lastRenderedPageBreak/>
         <w:t>Il n’affiche jamais la position exacte d’un joueur.</w:t>
       </w:r>
     </w:p>
@@ -5756,13 +5334,7 @@
         <w:spacing w:after="120" w:line="300" w:lineRule="auto"/>
       </w:pPr>
       <w:r>
-        <w:t>La position du té</w:t>
-      </w:r>
-      <w:r>
-        <w:t>léphone sert à calculer qui est à portée d’un sort ou d’un échange, et à repérer la triche. Un joueur ne voit jamais la position d’un autre (le sort Radar donne seulement une zone). Seul le Game Master voit les positions exactes, pour la sécurité et l’arbi</w:t>
-      </w:r>
-      <w:r>
-        <w:t>trage.</w:t>
+        <w:t>La position du téléphone sert à calculer qui est à portée d’un sort ou d’un échange, et à repérer la triche. Un joueur ne voit jamais la position d’un autre (le sort Radar donne seulement une zone). Seul le Game Master voit les positions exactes, pour la sécurité et l’arbitrage.</w:t>
       </w:r>
     </w:p>
     <w:p>
@@ -5786,10 +5358,7 @@
         <w:spacing w:after="120" w:line="300" w:lineRule="auto"/>
       </w:pPr>
       <w:r>
-        <w:t>La plupart des réglages s’adaptent tout seu</w:t>
-      </w:r>
-      <w:r>
-        <w:t>ls au nombre de joueurs présents. Le Game Master peut tous les modifier ou les bloquer à une valeur.</w:t>
+        <w:t>La plupart des réglages s’adaptent tout seuls au nombre de joueurs présents. Le Game Master peut tous les modifier ou les bloquer à une valeur.</w:t>
       </w:r>
     </w:p>
     <w:tbl>
@@ -6119,6 +5688,7 @@
               <w:spacing w:line="270" w:lineRule="auto"/>
             </w:pPr>
             <w:r>
+              <w:lastRenderedPageBreak/>
               <w:t>Kit de départ</w:t>
             </w:r>
           </w:p>
@@ -6144,15 +5714,7 @@
               <w:spacing w:line="270" w:lineRule="auto"/>
             </w:pPr>
             <w:r>
-              <w:t xml:space="preserve">50 </w:t>
-            </w:r>
-            <w:proofErr w:type="gramStart"/>
-            <w:r>
-              <w:t>jenny</w:t>
-            </w:r>
-            <w:proofErr w:type="gramEnd"/>
-            <w:r>
-              <w:t xml:space="preserve"> et un sort</w:t>
+              <w:t>50 jenny et un sort</w:t>
             </w:r>
           </w:p>
         </w:tc>
@@ -6207,15 +5769,7 @@
               <w:spacing w:line="270" w:lineRule="auto"/>
             </w:pPr>
             <w:r>
-              <w:t xml:space="preserve">10 </w:t>
-            </w:r>
-            <w:proofErr w:type="gramStart"/>
-            <w:r>
-              <w:t>jenny</w:t>
-            </w:r>
-            <w:proofErr w:type="gramEnd"/>
-            <w:r>
-              <w:t xml:space="preserve"> par bonne réponse</w:t>
+              <w:t>10 jenny par bonne réponse</w:t>
             </w:r>
           </w:p>
         </w:tc>
@@ -6245,13 +5799,8 @@
               <w:spacing w:line="270" w:lineRule="auto"/>
             </w:pPr>
             <w:r>
-              <w:t xml:space="preserve">Paquet de sorts à </w:t>
-            </w:r>
-            <w:proofErr w:type="spellStart"/>
-            <w:r>
-              <w:t>Masadora</w:t>
-            </w:r>
-            <w:proofErr w:type="spellEnd"/>
+              <w:t>Paquet de sorts à Masadora</w:t>
+            </w:r>
           </w:p>
         </w:tc>
         <w:tc>
@@ -6275,13 +5824,8 @@
               <w:spacing w:line="270" w:lineRule="auto"/>
             </w:pPr>
             <w:r>
-              <w:t xml:space="preserve">50 </w:t>
-            </w:r>
-            <w:proofErr w:type="gramStart"/>
-            <w:r>
-              <w:t>jenny</w:t>
-            </w:r>
-            <w:proofErr w:type="gramEnd"/>
+              <w:t>50 jenny</w:t>
+            </w:r>
           </w:p>
         </w:tc>
       </w:tr>
@@ -6335,15 +5879,7 @@
               <w:spacing w:line="270" w:lineRule="auto"/>
             </w:pPr>
             <w:r>
-              <w:t xml:space="preserve">30 </w:t>
-            </w:r>
-            <w:proofErr w:type="gramStart"/>
-            <w:r>
-              <w:t>jenny</w:t>
-            </w:r>
-            <w:proofErr w:type="gramEnd"/>
-            <w:r>
-              <w:t>, une tentative toutes les 15 minutes</w:t>
+              <w:t>30 jenny, une tentative toutes les 15 minutes</w:t>
             </w:r>
           </w:p>
         </w:tc>
@@ -6508,10 +6044,7 @@
               <w:spacing w:line="270" w:lineRule="auto"/>
             </w:pPr>
             <w:r>
-              <w:t>Calculés selon le nom</w:t>
-            </w:r>
-            <w:r>
-              <w:t>bre de joueurs</w:t>
+              <w:t>Calculés selon le nombre de joueurs</w:t>
             </w:r>
           </w:p>
         </w:tc>
@@ -6535,7 +6068,6 @@
         <w:pStyle w:val="Titre1"/>
       </w:pPr>
       <w:r>
-        <w:lastRenderedPageBreak/>
         <w:t>18. Où en est le projet</w:t>
       </w:r>
     </w:p>
@@ -6544,10 +6076,7 @@
         <w:spacing w:after="120" w:line="300" w:lineRule="auto"/>
       </w:pPr>
       <w:r>
-        <w:t>Les règles du jeu, le serveur et l’application des joueurs sont réalis</w:t>
-      </w:r>
-      <w:r>
-        <w:t>és et testés. Il reste à construire la console des arbitres et du Game Master, puis l’écran géant. Viendront ensuite la mise en ligne, l’impression des balises et une partie test sur le terrain pour régler la portée et les réglages.</w:t>
+        <w:t>Les règles du jeu, le serveur et l’application des joueurs sont réalisés et testés. Il reste à construire la console des arbitres et du Game Master, puis l’écran géant. Viendront ensuite la mise en ligne, l’impression des balises et une partie test sur le terrain pour régler la portée et les réglages.</w:t>
       </w:r>
     </w:p>
     <w:p>
@@ -6555,15 +6084,16 @@
         <w:spacing w:after="120" w:line="300" w:lineRule="auto"/>
       </w:pPr>
       <w:r>
-        <w:t>Quelques points restent</w:t>
-      </w:r>
-      <w:r>
-        <w:t xml:space="preserve"> à décider : le nom et l’habillage définitifs, le contenu de l’Examen et du test de Nen et la possibilité de garder son compte d’une partie à l’autre.</w:t>
+        <w:t>Quelques points restent à décider : le nom et l’habillage définitifs, le contenu de l’Examen et du test de Nen et la possibilité de garder son compte d’une partie à l’autre.</w:t>
       </w:r>
     </w:p>
     <w:sectPr>
-      <w:footerReference w:type="default" r:id="rId7"/>
-      <w:footerReference w:type="first" r:id="rId8"/>
+      <w:headerReference w:type="even" r:id="rId7"/>
+      <w:headerReference w:type="default" r:id="rId8"/>
+      <w:footerReference w:type="even" r:id="rId9"/>
+      <w:footerReference w:type="default" r:id="rId10"/>
+      <w:headerReference w:type="first" r:id="rId11"/>
+      <w:footerReference w:type="first" r:id="rId12"/>
       <w:pgSz w:w="11906" w:h="16838"/>
       <w:pgMar w:top="1418" w:right="1440" w:bottom="1418" w:left="1440" w:header="708" w:footer="708" w:gutter="0"/>
       <w:cols w:space="720"/>
@@ -6597,6 +6127,16 @@
 <w:ftr xmlns:wpc="http://schemas.microsoft.com/office/word/2010/wordprocessingCanvas" xmlns:cx="http://schemas.microsoft.com/office/drawing/2014/chartex" xmlns:cx1="http://schemas.microsoft.com/office/drawing/2015/9/8/chartex" xmlns:cx2="http://schemas.microsoft.com/office/drawing/2015/10/21/chartex" xmlns:cx3="http://schemas.microsoft.com/office/drawing/2016/5/9/chartex" xmlns:cx4="http://schemas.microsoft.com/office/drawing/2016/5/10/chartex" xmlns:cx5="http://schemas.microsoft.com/office/drawing/2016/5/11/chartex" xmlns:cx6="http://schemas.microsoft.com/office/drawing/2016/5/12/chartex" xmlns:cx7="http://schemas.microsoft.com/office/drawing/2016/5/13/chartex" xmlns:cx8="http://schemas.microsoft.com/office/drawing/2016/5/14/chartex" xmlns:mc="http://schemas.openxmlformats.org/markup-compatibility/2006" xmlns:aink="http://schemas.microsoft.com/office/drawing/2016/ink" xmlns:am3d="http://schemas.microsoft.com/office/drawing/2017/model3d" xmlns:o="urn:schemas-microsoft-com:office:office" xmlns:r="http://schemas.openxmlformats.org/officeDocument/2006/relationships" xmlns:m="http://schemas.openxmlformats.org/officeDocument/2006/math" xmlns:v="urn:schemas-microsoft-com:vml" xmlns:wp14="http://schemas.microsoft.com/office/word/2010/wordprocessingDrawing" xmlns:wp="http://schemas.openxmlformats.org/drawingml/2006/wordprocessingDrawing" xmlns:w10="urn:schemas-microsoft-com:office:word" xmlns:w="http://schemas.openxmlformats.org/wordprocessingml/2006/main" xmlns:w14="http://schemas.microsoft.com/office/word/2010/wordml" xmlns:w15="http://schemas.microsoft.com/office/word/2012/wordml" xmlns:w16cex="http://schemas.microsoft.com/office/word/2018/wordml/cex" xmlns:w16cid="http://schemas.microsoft.com/office/word/2016/wordml/cid" xmlns:w16="http://schemas.microsoft.com/office/word/2018/wordml" xmlns:w16sdtdh="http://schemas.microsoft.com/office/word/2020/wordml/sdtdatahash" xmlns:w16se="http://schemas.microsoft.com/office/word/2015/wordml/symex" xmlns:wpg="http://schemas.microsoft.com/office/word/2010/wordprocessingGroup" xmlns:wpi="http://schemas.microsoft.com/office/word/2010/wordprocessingInk" xmlns:wne="http://schemas.microsoft.com/office/word/2006/wordml" xmlns:wps="http://schemas.microsoft.com/office/word/2010/wordprocessingShape" mc:Ignorable="w14 w15 w16se w16cid w16 w16cex w16sdtdh wp14">
   <w:p>
     <w:pPr>
+      <w:pStyle w:val="Pieddepage"/>
+    </w:pPr>
+  </w:p>
+</w:ftr>
+</file>
+
+<file path=word/footer2.xml><?xml version="1.0" encoding="utf-8"?>
+<w:ftr xmlns:wpc="http://schemas.microsoft.com/office/word/2010/wordprocessingCanvas" xmlns:cx="http://schemas.microsoft.com/office/drawing/2014/chartex" xmlns:cx1="http://schemas.microsoft.com/office/drawing/2015/9/8/chartex" xmlns:cx2="http://schemas.microsoft.com/office/drawing/2015/10/21/chartex" xmlns:cx3="http://schemas.microsoft.com/office/drawing/2016/5/9/chartex" xmlns:cx4="http://schemas.microsoft.com/office/drawing/2016/5/10/chartex" xmlns:cx5="http://schemas.microsoft.com/office/drawing/2016/5/11/chartex" xmlns:cx6="http://schemas.microsoft.com/office/drawing/2016/5/12/chartex" xmlns:cx7="http://schemas.microsoft.com/office/drawing/2016/5/13/chartex" xmlns:cx8="http://schemas.microsoft.com/office/drawing/2016/5/14/chartex" xmlns:mc="http://schemas.openxmlformats.org/markup-compatibility/2006" xmlns:aink="http://schemas.microsoft.com/office/drawing/2016/ink" xmlns:am3d="http://schemas.microsoft.com/office/drawing/2017/model3d" xmlns:o="urn:schemas-microsoft-com:office:office" xmlns:r="http://schemas.openxmlformats.org/officeDocument/2006/relationships" xmlns:m="http://schemas.openxmlformats.org/officeDocument/2006/math" xmlns:v="urn:schemas-microsoft-com:vml" xmlns:wp14="http://schemas.microsoft.com/office/word/2010/wordprocessingDrawing" xmlns:wp="http://schemas.openxmlformats.org/drawingml/2006/wordprocessingDrawing" xmlns:w10="urn:schemas-microsoft-com:office:word" xmlns:w="http://schemas.openxmlformats.org/wordprocessingml/2006/main" xmlns:w14="http://schemas.microsoft.com/office/word/2010/wordml" xmlns:w15="http://schemas.microsoft.com/office/word/2012/wordml" xmlns:w16cex="http://schemas.microsoft.com/office/word/2018/wordml/cex" xmlns:w16cid="http://schemas.microsoft.com/office/word/2016/wordml/cid" xmlns:w16="http://schemas.microsoft.com/office/word/2018/wordml" xmlns:w16sdtdh="http://schemas.microsoft.com/office/word/2020/wordml/sdtdatahash" xmlns:w16se="http://schemas.microsoft.com/office/word/2015/wordml/symex" xmlns:wpg="http://schemas.microsoft.com/office/word/2010/wordprocessingGroup" xmlns:wpi="http://schemas.microsoft.com/office/word/2010/wordprocessingInk" xmlns:wne="http://schemas.microsoft.com/office/word/2006/wordml" xmlns:wps="http://schemas.microsoft.com/office/word/2010/wordprocessingShape" mc:Ignorable="w14 w15 w16se w16cid w16 w16cex w16sdtdh wp14">
+  <w:p>
+    <w:pPr>
       <w:jc w:val="center"/>
     </w:pPr>
     <w:r>
@@ -6607,16 +6147,14 @@
       </w:rPr>
       <w:t xml:space="preserve">Greed </w:t>
     </w:r>
-    <w:proofErr w:type="spellStart"/>
     <w:r>
       <w:rPr>
         <w:color w:val="595959"/>
         <w:sz w:val="18"/>
         <w:szCs w:val="18"/>
       </w:rPr>
-      <w:t>Quest</w:t>
+      <w:t>Island</w:t>
     </w:r>
-    <w:proofErr w:type="spellEnd"/>
     <w:r>
       <w:rPr>
         <w:color w:val="595959"/>
@@ -6670,7 +6208,7 @@
 </w:ftr>
 </file>
 
-<file path=word/footer2.xml><?xml version="1.0" encoding="utf-8"?>
+<file path=word/footer3.xml><?xml version="1.0" encoding="utf-8"?>
 <w:ftr xmlns:wpc="http://schemas.microsoft.com/office/word/2010/wordprocessingCanvas" xmlns:cx="http://schemas.microsoft.com/office/drawing/2014/chartex" xmlns:cx1="http://schemas.microsoft.com/office/drawing/2015/9/8/chartex" xmlns:cx2="http://schemas.microsoft.com/office/drawing/2015/10/21/chartex" xmlns:cx3="http://schemas.microsoft.com/office/drawing/2016/5/9/chartex" xmlns:cx4="http://schemas.microsoft.com/office/drawing/2016/5/10/chartex" xmlns:cx5="http://schemas.microsoft.com/office/drawing/2016/5/11/chartex" xmlns:cx6="http://schemas.microsoft.com/office/drawing/2016/5/12/chartex" xmlns:cx7="http://schemas.microsoft.com/office/drawing/2016/5/13/chartex" xmlns:cx8="http://schemas.microsoft.com/office/drawing/2016/5/14/chartex" xmlns:mc="http://schemas.openxmlformats.org/markup-compatibility/2006" xmlns:aink="http://schemas.microsoft.com/office/drawing/2016/ink" xmlns:am3d="http://schemas.microsoft.com/office/drawing/2017/model3d" xmlns:o="urn:schemas-microsoft-com:office:office" xmlns:r="http://schemas.openxmlformats.org/officeDocument/2006/relationships" xmlns:m="http://schemas.openxmlformats.org/officeDocument/2006/math" xmlns:v="urn:schemas-microsoft-com:vml" xmlns:wp14="http://schemas.microsoft.com/office/word/2010/wordprocessingDrawing" xmlns:wp="http://schemas.openxmlformats.org/drawingml/2006/wordprocessingDrawing" xmlns:w10="urn:schemas-microsoft-com:office:word" xmlns:w="http://schemas.openxmlformats.org/wordprocessingml/2006/main" xmlns:w14="http://schemas.microsoft.com/office/word/2010/wordml" xmlns:w15="http://schemas.microsoft.com/office/word/2012/wordml" xmlns:w16cex="http://schemas.microsoft.com/office/word/2018/wordml/cex" xmlns:w16cid="http://schemas.microsoft.com/office/word/2016/wordml/cid" xmlns:w16="http://schemas.microsoft.com/office/word/2018/wordml" xmlns:w16sdtdh="http://schemas.microsoft.com/office/word/2020/wordml/sdtdatahash" xmlns:w16se="http://schemas.microsoft.com/office/word/2015/wordml/symex" xmlns:wpg="http://schemas.microsoft.com/office/word/2010/wordprocessingGroup" xmlns:wpi="http://schemas.microsoft.com/office/word/2010/wordprocessingInk" xmlns:wne="http://schemas.microsoft.com/office/word/2006/wordml" xmlns:wps="http://schemas.microsoft.com/office/word/2010/wordprocessingShape" mc:Ignorable="w14 w15 w16se w16cid w16 w16cex w16sdtdh wp14">
   <w:p/>
 </w:ftr>
@@ -6693,6 +6231,36 @@
     </w:p>
   </w:footnote>
 </w:footnotes>
+</file>
+
+<file path=word/header1.xml><?xml version="1.0" encoding="utf-8"?>
+<w:hdr xmlns:wpc="http://schemas.microsoft.com/office/word/2010/wordprocessingCanvas" xmlns:cx="http://schemas.microsoft.com/office/drawing/2014/chartex" xmlns:cx1="http://schemas.microsoft.com/office/drawing/2015/9/8/chartex" xmlns:cx2="http://schemas.microsoft.com/office/drawing/2015/10/21/chartex" xmlns:cx3="http://schemas.microsoft.com/office/drawing/2016/5/9/chartex" xmlns:cx4="http://schemas.microsoft.com/office/drawing/2016/5/10/chartex" xmlns:cx5="http://schemas.microsoft.com/office/drawing/2016/5/11/chartex" xmlns:cx6="http://schemas.microsoft.com/office/drawing/2016/5/12/chartex" xmlns:cx7="http://schemas.microsoft.com/office/drawing/2016/5/13/chartex" xmlns:cx8="http://schemas.microsoft.com/office/drawing/2016/5/14/chartex" xmlns:mc="http://schemas.openxmlformats.org/markup-compatibility/2006" xmlns:aink="http://schemas.microsoft.com/office/drawing/2016/ink" xmlns:am3d="http://schemas.microsoft.com/office/drawing/2017/model3d" xmlns:o="urn:schemas-microsoft-com:office:office" xmlns:r="http://schemas.openxmlformats.org/officeDocument/2006/relationships" xmlns:m="http://schemas.openxmlformats.org/officeDocument/2006/math" xmlns:v="urn:schemas-microsoft-com:vml" xmlns:wp14="http://schemas.microsoft.com/office/word/2010/wordprocessingDrawing" xmlns:wp="http://schemas.openxmlformats.org/drawingml/2006/wordprocessingDrawing" xmlns:w10="urn:schemas-microsoft-com:office:word" xmlns:w="http://schemas.openxmlformats.org/wordprocessingml/2006/main" xmlns:w14="http://schemas.microsoft.com/office/word/2010/wordml" xmlns:w15="http://schemas.microsoft.com/office/word/2012/wordml" xmlns:w16cex="http://schemas.microsoft.com/office/word/2018/wordml/cex" xmlns:w16cid="http://schemas.microsoft.com/office/word/2016/wordml/cid" xmlns:w16="http://schemas.microsoft.com/office/word/2018/wordml" xmlns:w16sdtdh="http://schemas.microsoft.com/office/word/2020/wordml/sdtdatahash" xmlns:w16se="http://schemas.microsoft.com/office/word/2015/wordml/symex" xmlns:wpg="http://schemas.microsoft.com/office/word/2010/wordprocessingGroup" xmlns:wpi="http://schemas.microsoft.com/office/word/2010/wordprocessingInk" xmlns:wne="http://schemas.microsoft.com/office/word/2006/wordml" xmlns:wps="http://schemas.microsoft.com/office/word/2010/wordprocessingShape" mc:Ignorable="w14 w15 w16se w16cid w16 w16cex w16sdtdh wp14">
+  <w:p>
+    <w:pPr>
+      <w:pStyle w:val="En-tte"/>
+    </w:pPr>
+  </w:p>
+</w:hdr>
+</file>
+
+<file path=word/header2.xml><?xml version="1.0" encoding="utf-8"?>
+<w:hdr xmlns:wpc="http://schemas.microsoft.com/office/word/2010/wordprocessingCanvas" xmlns:cx="http://schemas.microsoft.com/office/drawing/2014/chartex" xmlns:cx1="http://schemas.microsoft.com/office/drawing/2015/9/8/chartex" xmlns:cx2="http://schemas.microsoft.com/office/drawing/2015/10/21/chartex" xmlns:cx3="http://schemas.microsoft.com/office/drawing/2016/5/9/chartex" xmlns:cx4="http://schemas.microsoft.com/office/drawing/2016/5/10/chartex" xmlns:cx5="http://schemas.microsoft.com/office/drawing/2016/5/11/chartex" xmlns:cx6="http://schemas.microsoft.com/office/drawing/2016/5/12/chartex" xmlns:cx7="http://schemas.microsoft.com/office/drawing/2016/5/13/chartex" xmlns:cx8="http://schemas.microsoft.com/office/drawing/2016/5/14/chartex" xmlns:mc="http://schemas.openxmlformats.org/markup-compatibility/2006" xmlns:aink="http://schemas.microsoft.com/office/drawing/2016/ink" xmlns:am3d="http://schemas.microsoft.com/office/drawing/2017/model3d" xmlns:o="urn:schemas-microsoft-com:office:office" xmlns:r="http://schemas.openxmlformats.org/officeDocument/2006/relationships" xmlns:m="http://schemas.openxmlformats.org/officeDocument/2006/math" xmlns:v="urn:schemas-microsoft-com:vml" xmlns:wp14="http://schemas.microsoft.com/office/word/2010/wordprocessingDrawing" xmlns:wp="http://schemas.openxmlformats.org/drawingml/2006/wordprocessingDrawing" xmlns:w10="urn:schemas-microsoft-com:office:word" xmlns:w="http://schemas.openxmlformats.org/wordprocessingml/2006/main" xmlns:w14="http://schemas.microsoft.com/office/word/2010/wordml" xmlns:w15="http://schemas.microsoft.com/office/word/2012/wordml" xmlns:w16cex="http://schemas.microsoft.com/office/word/2018/wordml/cex" xmlns:w16cid="http://schemas.microsoft.com/office/word/2016/wordml/cid" xmlns:w16="http://schemas.microsoft.com/office/word/2018/wordml" xmlns:w16sdtdh="http://schemas.microsoft.com/office/word/2020/wordml/sdtdatahash" xmlns:w16se="http://schemas.microsoft.com/office/word/2015/wordml/symex" xmlns:wpg="http://schemas.microsoft.com/office/word/2010/wordprocessingGroup" xmlns:wpi="http://schemas.microsoft.com/office/word/2010/wordprocessingInk" xmlns:wne="http://schemas.microsoft.com/office/word/2006/wordml" xmlns:wps="http://schemas.microsoft.com/office/word/2010/wordprocessingShape" mc:Ignorable="w14 w15 w16se w16cid w16 w16cex w16sdtdh wp14">
+  <w:p>
+    <w:pPr>
+      <w:pStyle w:val="En-tte"/>
+    </w:pPr>
+  </w:p>
+</w:hdr>
+</file>
+
+<file path=word/header3.xml><?xml version="1.0" encoding="utf-8"?>
+<w:hdr xmlns:wpc="http://schemas.microsoft.com/office/word/2010/wordprocessingCanvas" xmlns:cx="http://schemas.microsoft.com/office/drawing/2014/chartex" xmlns:cx1="http://schemas.microsoft.com/office/drawing/2015/9/8/chartex" xmlns:cx2="http://schemas.microsoft.com/office/drawing/2015/10/21/chartex" xmlns:cx3="http://schemas.microsoft.com/office/drawing/2016/5/9/chartex" xmlns:cx4="http://schemas.microsoft.com/office/drawing/2016/5/10/chartex" xmlns:cx5="http://schemas.microsoft.com/office/drawing/2016/5/11/chartex" xmlns:cx6="http://schemas.microsoft.com/office/drawing/2016/5/12/chartex" xmlns:cx7="http://schemas.microsoft.com/office/drawing/2016/5/13/chartex" xmlns:cx8="http://schemas.microsoft.com/office/drawing/2016/5/14/chartex" xmlns:mc="http://schemas.openxmlformats.org/markup-compatibility/2006" xmlns:aink="http://schemas.microsoft.com/office/drawing/2016/ink" xmlns:am3d="http://schemas.microsoft.com/office/drawing/2017/model3d" xmlns:o="urn:schemas-microsoft-com:office:office" xmlns:r="http://schemas.openxmlformats.org/officeDocument/2006/relationships" xmlns:m="http://schemas.openxmlformats.org/officeDocument/2006/math" xmlns:v="urn:schemas-microsoft-com:vml" xmlns:wp14="http://schemas.microsoft.com/office/word/2010/wordprocessingDrawing" xmlns:wp="http://schemas.openxmlformats.org/drawingml/2006/wordprocessingDrawing" xmlns:w10="urn:schemas-microsoft-com:office:word" xmlns:w="http://schemas.openxmlformats.org/wordprocessingml/2006/main" xmlns:w14="http://schemas.microsoft.com/office/word/2010/wordml" xmlns:w15="http://schemas.microsoft.com/office/word/2012/wordml" xmlns:w16cex="http://schemas.microsoft.com/office/word/2018/wordml/cex" xmlns:w16cid="http://schemas.microsoft.com/office/word/2016/wordml/cid" xmlns:w16="http://schemas.microsoft.com/office/word/2018/wordml" xmlns:w16sdtdh="http://schemas.microsoft.com/office/word/2020/wordml/sdtdatahash" xmlns:w16se="http://schemas.microsoft.com/office/word/2015/wordml/symex" xmlns:wpg="http://schemas.microsoft.com/office/word/2010/wordprocessingGroup" xmlns:wpi="http://schemas.microsoft.com/office/word/2010/wordprocessingInk" xmlns:wne="http://schemas.microsoft.com/office/word/2006/wordml" xmlns:wps="http://schemas.microsoft.com/office/word/2010/wordprocessingShape" mc:Ignorable="w14 w15 w16se w16cid w16 w16cex w16sdtdh wp14">
+  <w:p>
+    <w:pPr>
+      <w:pStyle w:val="En-tte"/>
+    </w:pPr>
+  </w:p>
+</w:hdr>
 </file>
 
 <file path=word/numbering.xml><?xml version="1.0" encoding="utf-8"?>
@@ -7658,6 +7226,48 @@
       <w:szCs w:val="20"/>
     </w:rPr>
   </w:style>
+  <w:style w:type="paragraph" w:styleId="En-tte">
+    <w:name w:val="header"/>
+    <w:basedOn w:val="Normal"/>
+    <w:link w:val="En-tteCar"/>
+    <w:uiPriority w:val="99"/>
+    <w:unhideWhenUsed/>
+    <w:rsid w:val="00D86F00"/>
+    <w:pPr>
+      <w:tabs>
+        <w:tab w:val="center" w:pos="4536"/>
+        <w:tab w:val="right" w:pos="9072"/>
+      </w:tabs>
+    </w:pPr>
+  </w:style>
+  <w:style w:type="character" w:customStyle="1" w:styleId="En-tteCar">
+    <w:name w:val="En-tête Car"/>
+    <w:basedOn w:val="Policepardfaut"/>
+    <w:link w:val="En-tte"/>
+    <w:uiPriority w:val="99"/>
+    <w:rsid w:val="00D86F00"/>
+  </w:style>
+  <w:style w:type="paragraph" w:styleId="Pieddepage">
+    <w:name w:val="footer"/>
+    <w:basedOn w:val="Normal"/>
+    <w:link w:val="PieddepageCar"/>
+    <w:uiPriority w:val="99"/>
+    <w:unhideWhenUsed/>
+    <w:rsid w:val="00D86F00"/>
+    <w:pPr>
+      <w:tabs>
+        <w:tab w:val="center" w:pos="4536"/>
+        <w:tab w:val="right" w:pos="9072"/>
+      </w:tabs>
+    </w:pPr>
+  </w:style>
+  <w:style w:type="character" w:customStyle="1" w:styleId="PieddepageCar">
+    <w:name w:val="Pied de page Car"/>
+    <w:basedOn w:val="Policepardfaut"/>
+    <w:link w:val="Pieddepage"/>
+    <w:uiPriority w:val="99"/>
+    <w:rsid w:val="00D86F00"/>
+  </w:style>
 </w:styles>
 </file>
 

</xml_diff>